<commit_message>
Reframe spring as the impact project, cap cohort at five schools
Monthly data-driven strategy seminars after each report cycle, the
spring semester framed as a leader impact project (adapted action
research), a five-school founding cap, and the non-refundable,
complete-to-earn-the-credential commitment on the page and in the
commitment letter.

Co-Authored-By: Claude Fable 5 <noreply@anthropic.com>
</commit_message>
<xml_diff>
--- a/public/fellowship/EDquity-Leader-Fellowship-Commitment-Letter.docx
+++ b/public/fellowship/EDquity-Leader-Fellowship-Commitment-Letter.docx
@@ -309,6 +309,34 @@
           <w:szCs w:val="22"/>
         </w:rPr>
         <w:t xml:space="preserve">The school consents to the fellow presenting our campus’s anonymized fall-versus-spring improvement metrics at the Impact Expo in June 2027, and elects to present [under our school’s name / de-identified].</w:t>
+      </w:r>
+    </w:p>
+    <w:p>
+      <w:pPr>
+        <w:pStyle w:val="ListParagraph"/>
+        <w:numPr>
+          <w:ilvl w:val="0"/>
+          <w:numId w:val="2"/>
+        </w:numPr>
+        <w:spacing w:after="120" w:line="300"/>
+      </w:pPr>
+      <w:r>
+        <w:rPr>
+          <w:rFonts w:ascii="Calibri" w:cs="Calibri" w:eastAsia="Calibri" w:hAnsi="Calibri"/>
+          <w:b/>
+          <w:bCs/>
+          <w:sz w:val="22"/>
+          <w:szCs w:val="22"/>
+        </w:rPr>
+        <w:t xml:space="preserve">Completion commitment: </w:t>
+      </w:r>
+      <w:r>
+        <w:rPr>
+          <w:rFonts w:ascii="Calibri" w:cs="Calibri" w:eastAsia="Calibri" w:hAnsi="Calibri"/>
+          <w:sz w:val="22"/>
+          <w:szCs w:val="22"/>
+        </w:rPr>
+        <w:t xml:space="preserve">We understand that the seat fee is non-refundable, that the fellowship requires completion of the full program including the final impact project, and that the Certified IEP Quality Improvement Leader credential is conferred only upon completion.</w:t>
       </w:r>
     </w:p>
     <w:p>

</xml_diff>